<commit_message>
Add Section 8 fault extension to voltage_regulation_paper
Section 8 (故障情景下的框架适应性扩展) adds 4 subsections:
- 8.1 SOP topology-switching model (Eqs 17-18, Ref [21])
- 8.2 FIDVR suppression via ESS+STL + PV LVRT (Eqs 19-22, Refs [22][23])
- 8.3 N-1 safety constraints in pre-stage LP (Eq 23, Ref [24])
- 8.4 Post-fault sensitivity re-identification (Eq 24, Ref [14])

8 new OMML equations (17-24), 5 new references ([21]-[25]).
File size: 19K -> 23K bytes.

https://claude.ai/code/session_0124gQ7f6mZuZqhHmiosbYQs
</commit_message>
<xml_diff>
--- a/paper/voltage_regulation_paper.docx
+++ b/paper/voltage_regulation_paper.docx
@@ -6243,6 +6243,1679 @@
           <w:sz w:val="21"/>
           <w:szCs w:val="21"/>
         </w:rPr>
+        <w:t xml:space="preserve">8  故障情景下的框架适应性扩展</w:t>
+      </w:r>
+    </w:p>
+    <w:p>
+      <w:pPr>
+        <w:pStyle w:val="Normal"/>
+        <w:jc w:val="both"/>
+        <w:spacing w:before="0" w:after="0" w:line="480" w:lineRule="auto"/>
+        <w:ind w:left="0" w:firstLine="420"/>
+      </w:pPr>
+      <w:r>
+        <w:rPr>
+          <w:rFonts w:ascii="Times New Roman" w:hAnsi="Times New Roman" w:eastAsia="宋体" w:cs="宋体"/>
+          <w:sz w:val="21"/>
+          <w:szCs w:val="21"/>
+        </w:rPr>
+        <w:t xml:space="preserve">三阶段框架以LinDistFlow为基础模型，固定拓扑假设是其核心前提之一。当配电网发生N-1故障（支路开断）时，网络拓扑发生离散跳变，对框架三个阶段均造成本质性冲击：①事前预规划阶段，正常拓扑T₀下的水电调度结果在故障拓扑T^(k)下可能大幅违反电压约束；②事中RLS更新阶段，平滑递推假设 S(t)连续变化，拓扑突变导致灵敏度矩阵离散跳变，RLS追踪失效；③事件触发重规划阶段，当前指标g(t)仅感知约束趋紧度，无法直接感知故障，需补充独立的故障触发条件。本节基于文献[21]～[25]梳理针对上述三类冲击的系统性扩展方案。</w:t>
+      </w:r>
+    </w:p>
+    <w:p>
+      <w:pPr>
+        <w:pStyle w:val="Normal"/>
+        <w:jc w:val="left"/>
+        <w:spacing w:before="120" w:after="60" w:line="480" w:lineRule="auto"/>
+      </w:pPr>
+      <w:r>
+        <w:rPr>
+          <w:rFonts w:ascii="Times New Roman" w:hAnsi="Times New Roman" w:eastAsia="黑体" w:cs="黑体"/>
+          <w:b/>
+          <w:bCs/>
+          <w:sz w:val="21"/>
+          <w:szCs w:val="21"/>
+        </w:rPr>
+        <w:t xml:space="preserve">8.1  拓扑切换软开关（SOP）辅助运行[21]</w:t>
+      </w:r>
+    </w:p>
+    <w:p>
+      <w:pPr>
+        <w:pStyle w:val="Normal"/>
+        <w:jc w:val="both"/>
+        <w:spacing w:before="0" w:after="0" w:line="480" w:lineRule="auto"/>
+        <w:ind w:left="0" w:firstLine="420"/>
+      </w:pPr>
+      <w:r>
+        <w:rPr>
+          <w:rFonts w:ascii="Times New Roman" w:hAnsi="Times New Roman" w:eastAsia="宋体" w:cs="宋体"/>
+          <w:sz w:val="21"/>
+          <w:szCs w:val="21"/>
+        </w:rPr>
+        <w:t xml:space="preserve">软开关（Soft Open Point, SOP）是基于背靠背变流器的电力电子装置，在故障时能无缝转接受影响区域至健康馈线，维持拓扑连通性。文献[21]建立SOP辅助的ADN实时协同运行模型，其SOP功率平衡约束为：</w:t>
+      </w:r>
+    </w:p>
+    <w:tbl>
+      <w:tblPr>
+        <w:tblStyle w:val="TableNormal"/>
+        <w:tblW w:w="9000" w:type="dxa"/>
+        <w:tblInd w:w="0" w:type="dxa"/>
+        <w:tblBorders>
+          <w:top w:val="none" w:sz="0" w:space="0" w:color="auto"/>
+          <w:left w:val="none" w:sz="0" w:space="0" w:color="auto"/>
+          <w:bottom w:val="none" w:sz="0" w:space="0" w:color="auto"/>
+          <w:right w:val="none" w:sz="0" w:space="0" w:color="auto"/>
+          <w:insideH w:val="none" w:sz="0" w:space="0" w:color="auto"/>
+          <w:insideV w:val="none" w:sz="0" w:space="0" w:color="auto"/>
+        </w:tblBorders>
+      </w:tblPr>
+      <w:tblGrid>
+        <w:gridCol w:w="8400"/>
+        <w:gridCol w:w="600"/>
+      </w:tblGrid>
+      <w:tr>
+        <w:tc>
+          <w:tcPr>
+            <w:tcW w:w="8400" w:type="dxa"/>
+            <w:vAlign w:val="center"/>
+            <w:tcBorders>
+              <w:top w:val="none" w:sz="0"/>
+              <w:left w:val="none" w:sz="0"/>
+              <w:bottom w:val="none" w:sz="0"/>
+              <w:right w:val="none" w:sz="0"/>
+            </w:tcBorders>
+          </w:tcPr>
+          <w:p>
+            <w:pPr>
+              <w:jc w:val="center"/>
+              <w:spacing w:before="0" w:after="0" w:line="240" w:lineRule="auto"/>
+            </w:pPr>
+            <m:oMath xmlns:m="http://schemas.openxmlformats.org/officeDocument/2006/math">
+              <m:sSub>
+                <m:sSubPr/>
+                <m:e>
+                  <m:r>
+                    <m:rPr>
+                      <m:sty m:val="i"/>
+                      <m:sz m:val="21"/>
+                    </m:rPr>
+                    <m:t xml:space="preserve">P</m:t>
+                  </m:r>
+                </m:e>
+                <m:sub>
+                  <m:r>
+                    <m:rPr>
+                      <m:sty m:val="i"/>
+                      <m:sz m:val="21"/>
+                    </m:rPr>
+                    <m:t xml:space="preserve">SOP,ij</m:t>
+                  </m:r>
+                </m:sub>
+              </m:sSub>
+              <m:r>
+                <m:rPr>
+                  <m:sty m:val="i"/>
+                  <m:sz m:val="21"/>
+                </m:rPr>
+                <m:t xml:space="preserve"> + </m:t>
+              </m:r>
+              <m:sSub>
+                <m:sSubPr/>
+                <m:e>
+                  <m:r>
+                    <m:rPr>
+                      <m:sty m:val="i"/>
+                      <m:sz m:val="21"/>
+                    </m:rPr>
+                    <m:t xml:space="preserve">P</m:t>
+                  </m:r>
+                </m:e>
+                <m:sub>
+                  <m:r>
+                    <m:rPr>
+                      <m:sty m:val="i"/>
+                      <m:sz m:val="21"/>
+                    </m:rPr>
+                    <m:t xml:space="preserve">SOP,ji</m:t>
+                  </m:r>
+                </m:sub>
+              </m:sSub>
+              <m:r>
+                <m:rPr>
+                  <m:sty m:val="i"/>
+                  <m:sz m:val="21"/>
+                </m:rPr>
+                <m:t xml:space="preserve"> + </m:t>
+              </m:r>
+              <m:sSub>
+                <m:sSubPr/>
+                <m:e>
+                  <m:r>
+                    <m:rPr>
+                      <m:sty m:val="i"/>
+                      <m:sz m:val="21"/>
+                    </m:rPr>
+                    <m:t xml:space="preserve">P</m:t>
+                  </m:r>
+                </m:e>
+                <m:sub>
+                  <m:r>
+                    <m:rPr>
+                      <m:sty m:val="i"/>
+                      <m:sz m:val="21"/>
+                    </m:rPr>
+                    <m:t xml:space="preserve">loss,SOP</m:t>
+                  </m:r>
+                </m:sub>
+              </m:sSub>
+              <m:r>
+                <m:rPr>
+                  <m:sty m:val="i"/>
+                  <m:sz m:val="21"/>
+                </m:rPr>
+                <m:t xml:space="preserve"> = 0</m:t>
+              </m:r>
+            </m:oMath>
+          </w:p>
+        </w:tc>
+        <w:tc>
+          <w:tcPr>
+            <w:tcW w:w="600" w:type="dxa"/>
+            <w:vAlign w:val="center"/>
+            <w:tcBorders>
+              <w:top w:val="none" w:sz="0"/>
+              <w:left w:val="none" w:sz="0"/>
+              <w:bottom w:val="none" w:sz="0"/>
+              <w:right w:val="none" w:sz="0"/>
+            </w:tcBorders>
+          </w:tcPr>
+          <w:p>
+            <w:pPr>
+              <w:jc w:val="right"/>
+              <w:spacing w:before="0" w:after="0" w:line="240" w:lineRule="auto"/>
+            </w:pPr>
+            <w:r>
+              <w:rPr>
+                <w:rFonts w:ascii="Times New Roman" w:hAnsi="Times New Roman" w:eastAsia="宋体" w:cs="宋体"/>
+                <w:sz w:val="21"/>
+                <w:szCs w:val="21"/>
+              </w:rPr>
+              <w:t xml:space="preserve">(17)</w:t>
+            </w:r>
+          </w:p>
+        </w:tc>
+      </w:tr>
+    </w:tbl>
+    <w:p>
+      <w:pPr>
+        <w:pStyle w:val="Normal"/>
+        <w:jc w:val="both"/>
+        <w:spacing w:before="0" w:after="0" w:line="480" w:lineRule="auto"/>
+        <w:ind w:left="0" w:firstLine="420"/>
+      </w:pPr>
+      <w:r>
+        <w:rPr>
+          <w:rFonts w:ascii="Times New Roman" w:hAnsi="Times New Roman" w:eastAsia="宋体" w:cs="宋体"/>
+          <w:sz w:val="21"/>
+          <w:szCs w:val="21"/>
+        </w:rPr>
+        <w:t xml:space="preserve">式中：P_SOP,ij 和 P_SOP,ji 为SOP两侧注入节点i、j的功率；P_loss,SOP 为变流器内部捯耗（二次损耗模型：a·P²+b）。故障k发生后新拓扑T^(k)下的电压灵敏度矩阵更新为：</w:t>
+      </w:r>
+    </w:p>
+    <w:tbl>
+      <w:tblPr>
+        <w:tblStyle w:val="TableNormal"/>
+        <w:tblW w:w="9000" w:type="dxa"/>
+        <w:tblInd w:w="0" w:type="dxa"/>
+        <w:tblBorders>
+          <w:top w:val="none" w:sz="0" w:space="0" w:color="auto"/>
+          <w:left w:val="none" w:sz="0" w:space="0" w:color="auto"/>
+          <w:bottom w:val="none" w:sz="0" w:space="0" w:color="auto"/>
+          <w:right w:val="none" w:sz="0" w:space="0" w:color="auto"/>
+          <w:insideH w:val="none" w:sz="0" w:space="0" w:color="auto"/>
+          <w:insideV w:val="none" w:sz="0" w:space="0" w:color="auto"/>
+        </w:tblBorders>
+      </w:tblPr>
+      <w:tblGrid>
+        <w:gridCol w:w="8400"/>
+        <w:gridCol w:w="600"/>
+      </w:tblGrid>
+      <w:tr>
+        <w:tc>
+          <w:tcPr>
+            <w:tcW w:w="8400" w:type="dxa"/>
+            <w:vAlign w:val="center"/>
+            <w:tcBorders>
+              <w:top w:val="none" w:sz="0"/>
+              <w:left w:val="none" w:sz="0"/>
+              <w:bottom w:val="none" w:sz="0"/>
+              <w:right w:val="none" w:sz="0"/>
+            </w:tcBorders>
+          </w:tcPr>
+          <w:p>
+            <w:pPr>
+              <w:jc w:val="center"/>
+              <w:spacing w:before="0" w:after="0" w:line="240" w:lineRule="auto"/>
+            </w:pPr>
+            <m:oMath xmlns:m="http://schemas.openxmlformats.org/officeDocument/2006/math">
+              <m:sSup>
+                <m:sSupPr/>
+                <m:e>
+                  <m:r>
+                    <m:rPr>
+                      <m:sty m:val="i"/>
+                      <m:sz m:val="21"/>
+                    </m:rPr>
+                    <m:t xml:space="preserve">S</m:t>
+                  </m:r>
+                </m:e>
+                <m:sup>
+                  <m:r>
+                    <m:rPr>
+                      <m:sty m:val="i"/>
+                      <m:sz m:val="21"/>
+                    </m:rPr>
+                    <m:t xml:space="preserve">(k)</m:t>
+                  </m:r>
+                </m:sup>
+              </m:sSup>
+              <m:r>
+                <m:rPr>
+                  <m:sty m:val="i"/>
+                  <m:sz m:val="21"/>
+                </m:rPr>
+                <m:t xml:space="preserve"> = LinDistFlow(</m:t>
+              </m:r>
+              <m:sSup>
+                <m:sSupPr/>
+                <m:e>
+                  <m:r>
+                    <m:rPr>
+                      <m:sty m:val="i"/>
+                      <m:sz m:val="21"/>
+                    </m:rPr>
+                    <m:t xml:space="preserve">T</m:t>
+                  </m:r>
+                </m:e>
+                <m:sup>
+                  <m:r>
+                    <m:rPr>
+                      <m:sty m:val="i"/>
+                      <m:sz m:val="21"/>
+                    </m:rPr>
+                    <m:t xml:space="preserve">(k)</m:t>
+                  </m:r>
+                </m:sup>
+              </m:sSup>
+              <m:r>
+                <m:rPr>
+                  <m:sty m:val="i"/>
+                  <m:sz m:val="21"/>
+                </m:rPr>
+                <m:t xml:space="preserve">)</m:t>
+              </m:r>
+            </m:oMath>
+          </w:p>
+        </w:tc>
+        <w:tc>
+          <w:tcPr>
+            <w:tcW w:w="600" w:type="dxa"/>
+            <w:vAlign w:val="center"/>
+            <w:tcBorders>
+              <w:top w:val="none" w:sz="0"/>
+              <w:left w:val="none" w:sz="0"/>
+              <w:bottom w:val="none" w:sz="0"/>
+              <w:right w:val="none" w:sz="0"/>
+            </w:tcBorders>
+          </w:tcPr>
+          <w:p>
+            <w:pPr>
+              <w:jc w:val="right"/>
+              <w:spacing w:before="0" w:after="0" w:line="240" w:lineRule="auto"/>
+            </w:pPr>
+            <w:r>
+              <w:rPr>
+                <w:rFonts w:ascii="Times New Roman" w:hAnsi="Times New Roman" w:eastAsia="宋体" w:cs="宋体"/>
+                <w:sz w:val="21"/>
+                <w:szCs w:val="21"/>
+              </w:rPr>
+              <w:t xml:space="preserve">(18)</w:t>
+            </w:r>
+          </w:p>
+        </w:tc>
+      </w:tr>
+    </w:tbl>
+    <w:p>
+      <w:pPr>
+        <w:pStyle w:val="Normal"/>
+        <w:jc w:val="both"/>
+        <w:spacing w:before="0" w:after="0" w:line="480" w:lineRule="auto"/>
+        <w:ind w:left="0" w:firstLine="420"/>
+      </w:pPr>
+      <w:r>
+        <w:rPr>
+          <w:rFonts w:ascii="Times New Roman" w:hAnsi="Times New Roman" w:eastAsia="宋体" w:cs="宋体"/>
+          <w:sz w:val="21"/>
+          <w:szCs w:val="21"/>
+        </w:rPr>
+        <w:t xml:space="preserve">在SOP柔性互联下，T^(k)是重构后的联通拓扑而非孤岛拓扑，可直接用LinDistFlow计算S^(k)，为8.4节灵敏度重辨识提供解析初始值。SOP还可独立控制两侧无功，为故障后快速电压支撑提供额外控制自由度。</w:t>
+      </w:r>
+    </w:p>
+    <w:p>
+      <w:pPr>
+        <w:pStyle w:val="Normal"/>
+        <w:jc w:val="left"/>
+        <w:spacing w:before="120" w:after="60" w:line="480" w:lineRule="auto"/>
+      </w:pPr>
+      <w:r>
+        <w:rPr>
+          <w:rFonts w:ascii="Times New Roman" w:hAnsi="Times New Roman" w:eastAsia="黑体" w:cs="黑体"/>
+          <w:b/>
+          <w:bCs/>
+          <w:sz w:val="21"/>
+          <w:szCs w:val="21"/>
+        </w:rPr>
+        <w:t xml:space="preserve">8.2  故障误导延迟电压恢复（FIDVR）抜制[22][23]</w:t>
+      </w:r>
+    </w:p>
+    <w:p>
+      <w:pPr>
+        <w:pStyle w:val="Normal"/>
+        <w:jc w:val="both"/>
+        <w:spacing w:before="0" w:after="0" w:line="480" w:lineRule="auto"/>
+        <w:ind w:left="0" w:firstLine="420"/>
+      </w:pPr>
+      <w:r>
+        <w:rPr>
+          <w:rFonts w:ascii="Times New Roman" w:hAnsi="Times New Roman" w:eastAsia="宋体" w:cs="宋体"/>
+          <w:sz w:val="21"/>
+          <w:szCs w:val="21"/>
+        </w:rPr>
+        <w:t xml:space="preserve">FIDVR（故障误导延迟电压恢复）是配电网中感应电动机在低电压期间堆转，故障清除后吸收大量感性无功、导致电压长时间无法恢复的失稳模式。文献[22]用信号时序逻辑（STL）控制律驱动储能系统进行FIDVR抜制。FIDVR检测条件（联合电压幅值与变化率）为：</w:t>
+      </w:r>
+    </w:p>
+    <w:tbl>
+      <w:tblPr>
+        <w:tblStyle w:val="TableNormal"/>
+        <w:tblW w:w="9000" w:type="dxa"/>
+        <w:tblInd w:w="0" w:type="dxa"/>
+        <w:tblBorders>
+          <w:top w:val="none" w:sz="0" w:space="0" w:color="auto"/>
+          <w:left w:val="none" w:sz="0" w:space="0" w:color="auto"/>
+          <w:bottom w:val="none" w:sz="0" w:space="0" w:color="auto"/>
+          <w:right w:val="none" w:sz="0" w:space="0" w:color="auto"/>
+          <w:insideH w:val="none" w:sz="0" w:space="0" w:color="auto"/>
+          <w:insideV w:val="none" w:sz="0" w:space="0" w:color="auto"/>
+        </w:tblBorders>
+      </w:tblPr>
+      <w:tblGrid>
+        <w:gridCol w:w="8400"/>
+        <w:gridCol w:w="600"/>
+      </w:tblGrid>
+      <w:tr>
+        <w:tc>
+          <w:tcPr>
+            <w:tcW w:w="8400" w:type="dxa"/>
+            <w:vAlign w:val="center"/>
+            <w:tcBorders>
+              <w:top w:val="none" w:sz="0"/>
+              <w:left w:val="none" w:sz="0"/>
+              <w:bottom w:val="none" w:sz="0"/>
+              <w:right w:val="none" w:sz="0"/>
+            </w:tcBorders>
+          </w:tcPr>
+          <w:p>
+            <w:pPr>
+              <w:jc w:val="center"/>
+              <w:spacing w:before="0" w:after="0" w:line="240" w:lineRule="auto"/>
+            </w:pPr>
+            <m:oMath xmlns:m="http://schemas.openxmlformats.org/officeDocument/2006/math">
+              <m:sSub>
+                <m:sSubPr/>
+                <m:e>
+                  <m:r>
+                    <m:rPr>
+                      <m:sty m:val="i"/>
+                      <m:sz m:val="21"/>
+                    </m:rPr>
+                    <m:t xml:space="preserve">Φ</m:t>
+                  </m:r>
+                </m:e>
+                <m:sub>
+                  <m:r>
+                    <m:rPr>
+                      <m:sty m:val="i"/>
+                      <m:sz m:val="21"/>
+                    </m:rPr>
+                    <m:t xml:space="preserve">FIDVR</m:t>
+                  </m:r>
+                </m:sub>
+              </m:sSub>
+              <m:r>
+                <m:rPr>
+                  <m:sty m:val="i"/>
+                  <m:sz m:val="21"/>
+                </m:rPr>
+                <m:t xml:space="preserve">(t): V(t) &lt; </m:t>
+              </m:r>
+              <m:sSub>
+                <m:sSubPr/>
+                <m:e>
+                  <m:r>
+                    <m:rPr>
+                      <m:sty m:val="i"/>
+                      <m:sz m:val="21"/>
+                    </m:rPr>
+                    <m:t xml:space="preserve">V</m:t>
+                  </m:r>
+                </m:e>
+                <m:sub>
+                  <m:r>
+                    <m:rPr>
+                      <m:sty m:val="i"/>
+                      <m:sz m:val="21"/>
+                    </m:rPr>
+                    <m:t xml:space="preserve">th</m:t>
+                  </m:r>
+                </m:sub>
+              </m:sSub>
+              <m:r>
+                <m:rPr>
+                  <m:sty m:val="i"/>
+                  <m:sz m:val="21"/>
+                </m:rPr>
+                <m:t xml:space="preserve"> AND dV/dt &lt; 0</m:t>
+              </m:r>
+            </m:oMath>
+          </w:p>
+        </w:tc>
+        <w:tc>
+          <w:tcPr>
+            <w:tcW w:w="600" w:type="dxa"/>
+            <w:vAlign w:val="center"/>
+            <w:tcBorders>
+              <w:top w:val="none" w:sz="0"/>
+              <w:left w:val="none" w:sz="0"/>
+              <w:bottom w:val="none" w:sz="0"/>
+              <w:right w:val="none" w:sz="0"/>
+            </w:tcBorders>
+          </w:tcPr>
+          <w:p>
+            <w:pPr>
+              <w:jc w:val="right"/>
+              <w:spacing w:before="0" w:after="0" w:line="240" w:lineRule="auto"/>
+            </w:pPr>
+            <w:r>
+              <w:rPr>
+                <w:rFonts w:ascii="Times New Roman" w:hAnsi="Times New Roman" w:eastAsia="宋体" w:cs="宋体"/>
+                <w:sz w:val="21"/>
+                <w:szCs w:val="21"/>
+              </w:rPr>
+              <w:t xml:space="preserve">(19)</w:t>
+            </w:r>
+          </w:p>
+        </w:tc>
+      </w:tr>
+    </w:tbl>
+    <w:p>
+      <w:pPr>
+        <w:pStyle w:val="Normal"/>
+        <w:jc w:val="both"/>
+        <w:spacing w:before="0" w:after="0" w:line="480" w:lineRule="auto"/>
+        <w:ind w:left="0" w:firstLine="420"/>
+      </w:pPr>
+      <w:r>
+        <w:rPr>
+          <w:rFonts w:ascii="Times New Roman" w:hAnsi="Times New Roman" w:eastAsia="宋体" w:cs="宋体"/>
+          <w:sz w:val="21"/>
+          <w:szCs w:val="21"/>
+        </w:rPr>
+        <w:t xml:space="preserve">式中：V_th 为检测阈値（一般取 0.85～0.90 p.u.）。定义STL满足度（robustness metric）量化电压恢复质量：</w:t>
+      </w:r>
+    </w:p>
+    <w:tbl>
+      <w:tblPr>
+        <w:tblStyle w:val="TableNormal"/>
+        <w:tblW w:w="9000" w:type="dxa"/>
+        <w:tblInd w:w="0" w:type="dxa"/>
+        <w:tblBorders>
+          <w:top w:val="none" w:sz="0" w:space="0" w:color="auto"/>
+          <w:left w:val="none" w:sz="0" w:space="0" w:color="auto"/>
+          <w:bottom w:val="none" w:sz="0" w:space="0" w:color="auto"/>
+          <w:right w:val="none" w:sz="0" w:space="0" w:color="auto"/>
+          <w:insideH w:val="none" w:sz="0" w:space="0" w:color="auto"/>
+          <w:insideV w:val="none" w:sz="0" w:space="0" w:color="auto"/>
+        </w:tblBorders>
+      </w:tblPr>
+      <w:tblGrid>
+        <w:gridCol w:w="8400"/>
+        <w:gridCol w:w="600"/>
+      </w:tblGrid>
+      <w:tr>
+        <w:tc>
+          <w:tcPr>
+            <w:tcW w:w="8400" w:type="dxa"/>
+            <w:vAlign w:val="center"/>
+            <w:tcBorders>
+              <w:top w:val="none" w:sz="0"/>
+              <w:left w:val="none" w:sz="0"/>
+              <w:bottom w:val="none" w:sz="0"/>
+              <w:right w:val="none" w:sz="0"/>
+            </w:tcBorders>
+          </w:tcPr>
+          <w:p>
+            <w:pPr>
+              <w:jc w:val="center"/>
+              <w:spacing w:before="0" w:after="0" w:line="240" w:lineRule="auto"/>
+            </w:pPr>
+            <m:oMath xmlns:m="http://schemas.openxmlformats.org/officeDocument/2006/math">
+              <m:sSup>
+                <m:sSupPr/>
+                <m:e>
+                  <m:r>
+                    <m:rPr>
+                      <m:sty m:val="i"/>
+                      <m:sz m:val="21"/>
+                    </m:rPr>
+                    <m:t xml:space="preserve">ρ</m:t>
+                  </m:r>
+                </m:e>
+                <m:sup>
+                  <m:r>
+                    <m:rPr>
+                      <m:sty m:val="i"/>
+                      <m:sz m:val="21"/>
+                    </m:rPr>
+                    <m:t xml:space="preserve">φ</m:t>
+                  </m:r>
+                </m:sup>
+              </m:sSup>
+              <m:r>
+                <m:rPr>
+                  <m:sty m:val="i"/>
+                  <m:sz m:val="21"/>
+                </m:rPr>
+                <m:t xml:space="preserve">(t) = </m:t>
+              </m:r>
+              <m:sSub>
+                <m:sSubPr/>
+                <m:e>
+                  <m:r>
+                    <m:rPr>
+                      <m:sty m:val="i"/>
+                      <m:sz m:val="21"/>
+                    </m:rPr>
+                    <m:t xml:space="preserve">min</m:t>
+                  </m:r>
+                </m:e>
+                <m:sub>
+                  <m:r>
+                    <m:rPr>
+                      <m:sty m:val="i"/>
+                      <m:sz m:val="21"/>
+                    </m:rPr>
+                    <m:t xml:space="preserve">s ∈ [t, t+T_rec]</m:t>
+                  </m:r>
+                </m:sub>
+              </m:sSub>
+              <m:r>
+                <m:rPr>
+                  <m:sty m:val="i"/>
+                  <m:sz m:val="21"/>
+                </m:rPr>
+                <m:t xml:space="preserve">(V(s) − </m:t>
+              </m:r>
+              <m:sSub>
+                <m:sSubPr/>
+                <m:e>
+                  <m:r>
+                    <m:rPr>
+                      <m:sty m:val="i"/>
+                      <m:sz m:val="21"/>
+                    </m:rPr>
+                    <m:t xml:space="preserve">V</m:t>
+                  </m:r>
+                </m:e>
+                <m:sub>
+                  <m:r>
+                    <m:rPr>
+                      <m:sty m:val="i"/>
+                      <m:sz m:val="21"/>
+                    </m:rPr>
+                    <m:t xml:space="preserve">min</m:t>
+                  </m:r>
+                </m:sub>
+              </m:sSub>
+              <m:r>
+                <m:rPr>
+                  <m:sty m:val="i"/>
+                  <m:sz m:val="21"/>
+                </m:rPr>
+                <m:t xml:space="preserve">)</m:t>
+              </m:r>
+            </m:oMath>
+          </w:p>
+        </w:tc>
+        <w:tc>
+          <w:tcPr>
+            <w:tcW w:w="600" w:type="dxa"/>
+            <w:vAlign w:val="center"/>
+            <w:tcBorders>
+              <w:top w:val="none" w:sz="0"/>
+              <w:left w:val="none" w:sz="0"/>
+              <w:bottom w:val="none" w:sz="0"/>
+              <w:right w:val="none" w:sz="0"/>
+            </w:tcBorders>
+          </w:tcPr>
+          <w:p>
+            <w:pPr>
+              <w:jc w:val="right"/>
+              <w:spacing w:before="0" w:after="0" w:line="240" w:lineRule="auto"/>
+            </w:pPr>
+            <w:r>
+              <w:rPr>
+                <w:rFonts w:ascii="Times New Roman" w:hAnsi="Times New Roman" w:eastAsia="宋体" w:cs="宋体"/>
+                <w:sz w:val="21"/>
+                <w:szCs w:val="21"/>
+              </w:rPr>
+              <w:t xml:space="preserve">(20)</w:t>
+            </w:r>
+          </w:p>
+        </w:tc>
+      </w:tr>
+    </w:tbl>
+    <w:p>
+      <w:pPr>
+        <w:pStyle w:val="Normal"/>
+        <w:jc w:val="both"/>
+        <w:spacing w:before="0" w:after="0" w:line="480" w:lineRule="auto"/>
+        <w:ind w:left="0" w:firstLine="420"/>
+      </w:pPr>
+      <w:r>
+        <w:rPr>
+          <w:rFonts w:ascii="Times New Roman" w:hAnsi="Times New Roman" w:eastAsia="宋体" w:cs="宋体"/>
+          <w:sz w:val="21"/>
+          <w:szCs w:val="21"/>
+        </w:rPr>
+        <w:t xml:space="preserve">式中：T_rec 为规定最大恢复时间（典型値 2～5 s）；ρ^φ(t)&gt;0 表示STL约束满足，值越大恢复裕度越充足。最大化STL满足度的ESS紧急控制律（同时约束SOC偏差）为：</w:t>
+      </w:r>
+    </w:p>
+    <w:tbl>
+      <w:tblPr>
+        <w:tblStyle w:val="TableNormal"/>
+        <w:tblW w:w="9000" w:type="dxa"/>
+        <w:tblInd w:w="0" w:type="dxa"/>
+        <w:tblBorders>
+          <w:top w:val="none" w:sz="0" w:space="0" w:color="auto"/>
+          <w:left w:val="none" w:sz="0" w:space="0" w:color="auto"/>
+          <w:bottom w:val="none" w:sz="0" w:space="0" w:color="auto"/>
+          <w:right w:val="none" w:sz="0" w:space="0" w:color="auto"/>
+          <w:insideH w:val="none" w:sz="0" w:space="0" w:color="auto"/>
+          <w:insideV w:val="none" w:sz="0" w:space="0" w:color="auto"/>
+        </w:tblBorders>
+      </w:tblPr>
+      <w:tblGrid>
+        <w:gridCol w:w="8400"/>
+        <w:gridCol w:w="600"/>
+      </w:tblGrid>
+      <w:tr>
+        <w:tc>
+          <w:tcPr>
+            <w:tcW w:w="8400" w:type="dxa"/>
+            <w:vAlign w:val="center"/>
+            <w:tcBorders>
+              <w:top w:val="none" w:sz="0"/>
+              <w:left w:val="none" w:sz="0"/>
+              <w:bottom w:val="none" w:sz="0"/>
+              <w:right w:val="none" w:sz="0"/>
+            </w:tcBorders>
+          </w:tcPr>
+          <w:p>
+            <w:pPr>
+              <w:jc w:val="center"/>
+              <w:spacing w:before="0" w:after="0" w:line="240" w:lineRule="auto"/>
+            </w:pPr>
+            <m:oMath xmlns:m="http://schemas.openxmlformats.org/officeDocument/2006/math">
+              <m:sSup>
+                <m:sSupPr/>
+                <m:e>
+                  <m:sSub>
+                    <m:sSubPr/>
+                    <m:e>
+                      <m:r>
+                        <m:rPr>
+                          <m:sty m:val="i"/>
+                          <m:sz m:val="21"/>
+                        </m:rPr>
+                        <m:t xml:space="preserve">P</m:t>
+                      </m:r>
+                    </m:e>
+                    <m:sub>
+                      <m:r>
+                        <m:rPr>
+                          <m:sty m:val="i"/>
+                          <m:sz m:val="21"/>
+                        </m:rPr>
+                        <m:t xml:space="preserve">ESS</m:t>
+                      </m:r>
+                    </m:sub>
+                  </m:sSub>
+                </m:e>
+                <m:sup>
+                  <m:r>
+                    <m:rPr>
+                      <m:sty m:val="i"/>
+                      <m:sz m:val="21"/>
+                    </m:rPr>
+                    <m:t xml:space="preserve">*</m:t>
+                  </m:r>
+                </m:sup>
+              </m:sSup>
+              <m:r>
+                <m:rPr>
+                  <m:sty m:val="i"/>
+                  <m:sz m:val="21"/>
+                </m:rPr>
+                <m:t xml:space="preserve">(t) = argmin </m:t>
+              </m:r>
+              <m:sSub>
+                <m:sSubPr/>
+                <m:e>
+                  <m:r>
+                    <m:rPr>
+                      <m:sty m:val="i"/>
+                      <m:sz m:val="21"/>
+                    </m:rPr>
+                    <m:t xml:space="preserve"/>
+                  </m:r>
+                </m:e>
+                <m:sub>
+                  <m:r>
+                    <m:rPr>
+                      <m:sty m:val="i"/>
+                      <m:sz m:val="21"/>
+                    </m:rPr>
+                    <m:t xml:space="preserve">P</m:t>
+                  </m:r>
+                </m:sub>
+              </m:sSub>
+              <m:r>
+                <m:rPr>
+                  <m:sty m:val="i"/>
+                  <m:sz m:val="21"/>
+                </m:rPr>
+                <m:t xml:space="preserve"> {−ρ</m:t>
+              </m:r>
+              <m:sSup>
+                <m:sSupPr/>
+                <m:e>
+                  <m:r>
+                    <m:rPr>
+                      <m:sty m:val="i"/>
+                      <m:sz m:val="21"/>
+                    </m:rPr>
+                    <m:t xml:space="preserve"/>
+                  </m:r>
+                </m:e>
+                <m:sup>
+                  <m:r>
+                    <m:rPr>
+                      <m:sty m:val="i"/>
+                      <m:sz m:val="21"/>
+                    </m:rPr>
+                    <m:t xml:space="preserve">φ</m:t>
+                  </m:r>
+                </m:sup>
+              </m:sSup>
+              <m:r>
+                <m:rPr>
+                  <m:sty m:val="i"/>
+                  <m:sz m:val="21"/>
+                </m:rPr>
+                <m:t xml:space="preserve">(t) + λ_E·(E(t)−</m:t>
+              </m:r>
+              <m:sSub>
+                <m:sSubPr/>
+                <m:e>
+                  <m:r>
+                    <m:rPr>
+                      <m:sty m:val="i"/>
+                      <m:sz m:val="21"/>
+                    </m:rPr>
+                    <m:t xml:space="preserve">E</m:t>
+                  </m:r>
+                </m:e>
+                <m:sub>
+                  <m:r>
+                    <m:rPr>
+                      <m:sty m:val="i"/>
+                      <m:sz m:val="21"/>
+                    </m:rPr>
+                    <m:t xml:space="preserve">ref</m:t>
+                  </m:r>
+                </m:sub>
+              </m:sSub>
+              <m:r>
+                <m:rPr>
+                  <m:sty m:val="i"/>
+                  <m:sz m:val="21"/>
+                </m:rPr>
+                <m:t xml:space="preserve">)²}</m:t>
+              </m:r>
+            </m:oMath>
+          </w:p>
+        </w:tc>
+        <w:tc>
+          <w:tcPr>
+            <w:tcW w:w="600" w:type="dxa"/>
+            <w:vAlign w:val="center"/>
+            <w:tcBorders>
+              <w:top w:val="none" w:sz="0"/>
+              <w:left w:val="none" w:sz="0"/>
+              <w:bottom w:val="none" w:sz="0"/>
+              <w:right w:val="none" w:sz="0"/>
+            </w:tcBorders>
+          </w:tcPr>
+          <w:p>
+            <w:pPr>
+              <w:jc w:val="right"/>
+              <w:spacing w:before="0" w:after="0" w:line="240" w:lineRule="auto"/>
+            </w:pPr>
+            <w:r>
+              <w:rPr>
+                <w:rFonts w:ascii="Times New Roman" w:hAnsi="Times New Roman" w:eastAsia="宋体" w:cs="宋体"/>
+                <w:sz w:val="21"/>
+                <w:szCs w:val="21"/>
+              </w:rPr>
+              <w:t xml:space="preserve">(21)</w:t>
+            </w:r>
+          </w:p>
+        </w:tc>
+      </w:tr>
+    </w:tbl>
+    <w:p>
+      <w:pPr>
+        <w:pStyle w:val="Normal"/>
+        <w:jc w:val="both"/>
+        <w:spacing w:before="0" w:after="0" w:line="480" w:lineRule="auto"/>
+        <w:ind w:left="0" w:firstLine="420"/>
+      </w:pPr>
+      <w:r>
+        <w:rPr>
+          <w:rFonts w:ascii="Times New Roman" w:hAnsi="Times New Roman" w:eastAsia="宋体" w:cs="宋体"/>
+          <w:sz w:val="21"/>
+          <w:szCs w:val="21"/>
+        </w:rPr>
+        <w:t xml:space="preserve">式中：λ_E 为SOC偏差权重系数。该控制律保证在最大T_rec内将电压恢复至V_min以上，与三阶段框架事中阶段储能快速响应在执行层直接对接。</w:t>
+      </w:r>
+    </w:p>
+    <w:p>
+      <w:pPr>
+        <w:pStyle w:val="Normal"/>
+        <w:jc w:val="both"/>
+        <w:spacing w:before="0" w:after="0" w:line="480" w:lineRule="auto"/>
+        <w:ind w:left="0" w:firstLine="420"/>
+      </w:pPr>
+      <w:r>
+        <w:rPr>
+          <w:rFonts w:ascii="Times New Roman" w:hAnsi="Times New Roman" w:eastAsia="宋体" w:cs="宋体"/>
+          <w:sz w:val="21"/>
+          <w:szCs w:val="21"/>
+        </w:rPr>
+        <w:t xml:space="preserve">故障期间光伏逆变器须满足低电压穿越（LVRT）要求。文献[23]表明，适当增大无功电流增益 k_LVRT 可显著加快短时恢复。LVRT无功电流注入（依据GB/T 19964或VDE-AR-N 4120标准）为：</w:t>
+      </w:r>
+    </w:p>
+    <w:tbl>
+      <w:tblPr>
+        <w:tblStyle w:val="TableNormal"/>
+        <w:tblW w:w="9000" w:type="dxa"/>
+        <w:tblInd w:w="0" w:type="dxa"/>
+        <w:tblBorders>
+          <w:top w:val="none" w:sz="0" w:space="0" w:color="auto"/>
+          <w:left w:val="none" w:sz="0" w:space="0" w:color="auto"/>
+          <w:bottom w:val="none" w:sz="0" w:space="0" w:color="auto"/>
+          <w:right w:val="none" w:sz="0" w:space="0" w:color="auto"/>
+          <w:insideH w:val="none" w:sz="0" w:space="0" w:color="auto"/>
+          <w:insideV w:val="none" w:sz="0" w:space="0" w:color="auto"/>
+        </w:tblBorders>
+      </w:tblPr>
+      <w:tblGrid>
+        <w:gridCol w:w="8400"/>
+        <w:gridCol w:w="600"/>
+      </w:tblGrid>
+      <w:tr>
+        <w:tc>
+          <w:tcPr>
+            <w:tcW w:w="8400" w:type="dxa"/>
+            <w:vAlign w:val="center"/>
+            <w:tcBorders>
+              <w:top w:val="none" w:sz="0"/>
+              <w:left w:val="none" w:sz="0"/>
+              <w:bottom w:val="none" w:sz="0"/>
+              <w:right w:val="none" w:sz="0"/>
+            </w:tcBorders>
+          </w:tcPr>
+          <w:p>
+            <w:pPr>
+              <w:jc w:val="center"/>
+              <w:spacing w:before="0" w:after="0" w:line="240" w:lineRule="auto"/>
+            </w:pPr>
+            <m:oMath xmlns:m="http://schemas.openxmlformats.org/officeDocument/2006/math">
+              <m:sSub>
+                <m:sSubPr/>
+                <m:e>
+                  <m:r>
+                    <m:rPr>
+                      <m:sty m:val="i"/>
+                      <m:sz m:val="21"/>
+                    </m:rPr>
+                    <m:t xml:space="preserve">I</m:t>
+                  </m:r>
+                </m:e>
+                <m:sub>
+                  <m:r>
+                    <m:rPr>
+                      <m:sty m:val="i"/>
+                      <m:sz m:val="21"/>
+                    </m:rPr>
+                    <m:t xml:space="preserve">Q,PV</m:t>
+                  </m:r>
+                </m:sub>
+              </m:sSub>
+              <m:r>
+                <m:rPr>
+                  <m:sty m:val="i"/>
+                  <m:sz m:val="21"/>
+                </m:rPr>
+                <m:t xml:space="preserve">(t) = </m:t>
+              </m:r>
+              <m:sSub>
+                <m:sSubPr/>
+                <m:e>
+                  <m:r>
+                    <m:rPr>
+                      <m:sty m:val="i"/>
+                      <m:sz m:val="21"/>
+                    </m:rPr>
+                    <m:t xml:space="preserve">k</m:t>
+                  </m:r>
+                </m:e>
+                <m:sub>
+                  <m:r>
+                    <m:rPr>
+                      <m:sty m:val="i"/>
+                      <m:sz m:val="21"/>
+                    </m:rPr>
+                    <m:t xml:space="preserve">LVRT</m:t>
+                  </m:r>
+                </m:sub>
+              </m:sSub>
+              <m:r>
+                <m:rPr>
+                  <m:sty m:val="i"/>
+                  <m:sz m:val="21"/>
+                </m:rPr>
+                <m:t xml:space="preserve"> · max(0, 1−</m:t>
+              </m:r>
+              <m:f>
+                <m:fPr/>
+                <m:num>
+                  <m:r>
+                    <m:rPr>
+                      <m:sty m:val="i"/>
+                      <m:sz m:val="21"/>
+                    </m:rPr>
+                    <m:t xml:space="preserve">V(t)</m:t>
+                  </m:r>
+                </m:num>
+                <m:den>
+                  <m:sSub>
+                    <m:sSubPr/>
+                    <m:e>
+                      <m:r>
+                        <m:rPr>
+                          <m:sty m:val="i"/>
+                          <m:sz m:val="21"/>
+                        </m:rPr>
+                        <m:t xml:space="preserve">V</m:t>
+                      </m:r>
+                    </m:e>
+                    <m:sub>
+                      <m:r>
+                        <m:rPr>
+                          <m:sty m:val="i"/>
+                          <m:sz m:val="21"/>
+                        </m:rPr>
+                        <m:t xml:space="preserve">n</m:t>
+                      </m:r>
+                    </m:sub>
+                  </m:sSub>
+                </m:den>
+              </m:f>
+              <m:r>
+                <m:rPr>
+                  <m:sty m:val="i"/>
+                  <m:sz m:val="21"/>
+                </m:rPr>
+                <m:t xml:space="preserve">) · </m:t>
+              </m:r>
+              <m:sSub>
+                <m:sSubPr/>
+                <m:e>
+                  <m:r>
+                    <m:rPr>
+                      <m:sty m:val="i"/>
+                      <m:sz m:val="21"/>
+                    </m:rPr>
+                    <m:t xml:space="preserve">I</m:t>
+                  </m:r>
+                </m:e>
+                <m:sub>
+                  <m:r>
+                    <m:rPr>
+                      <m:sty m:val="i"/>
+                      <m:sz m:val="21"/>
+                    </m:rPr>
+                    <m:t xml:space="preserve">n</m:t>
+                  </m:r>
+                </m:sub>
+              </m:sSub>
+            </m:oMath>
+          </w:p>
+        </w:tc>
+        <w:tc>
+          <w:tcPr>
+            <w:tcW w:w="600" w:type="dxa"/>
+            <w:vAlign w:val="center"/>
+            <w:tcBorders>
+              <w:top w:val="none" w:sz="0"/>
+              <w:left w:val="none" w:sz="0"/>
+              <w:bottom w:val="none" w:sz="0"/>
+              <w:right w:val="none" w:sz="0"/>
+            </w:tcBorders>
+          </w:tcPr>
+          <w:p>
+            <w:pPr>
+              <w:jc w:val="right"/>
+              <w:spacing w:before="0" w:after="0" w:line="240" w:lineRule="auto"/>
+            </w:pPr>
+            <w:r>
+              <w:rPr>
+                <w:rFonts w:ascii="Times New Roman" w:hAnsi="Times New Roman" w:eastAsia="宋体" w:cs="宋体"/>
+                <w:sz w:val="21"/>
+                <w:szCs w:val="21"/>
+              </w:rPr>
+              <w:t xml:space="preserve">(22)</w:t>
+            </w:r>
+          </w:p>
+        </w:tc>
+      </w:tr>
+    </w:tbl>
+    <w:p>
+      <w:pPr>
+        <w:pStyle w:val="Normal"/>
+        <w:jc w:val="both"/>
+        <w:spacing w:before="0" w:after="0" w:line="480" w:lineRule="auto"/>
+        <w:ind w:left="0" w:firstLine="420"/>
+      </w:pPr>
+      <w:r>
+        <w:rPr>
+          <w:rFonts w:ascii="Times New Roman" w:hAnsi="Times New Roman" w:eastAsia="宋体" w:cs="宋体"/>
+          <w:sz w:val="21"/>
+          <w:szCs w:val="21"/>
+        </w:rPr>
+        <w:t xml:space="preserve">式中：k_LVRT≥2，V_n 为额定电压，I_n 为PV额定电流。LVRT行为改变故障期有功/无功注入特性，需在P-box不确定性集中对故障工况单独建模，区别于式(4)中正常运行的PV出功区间[P_pv(t), ̅P_pv(t)]。</w:t>
+      </w:r>
+    </w:p>
+    <w:p>
+      <w:pPr>
+        <w:pStyle w:val="Normal"/>
+        <w:jc w:val="left"/>
+        <w:spacing w:before="120" w:after="60" w:line="480" w:lineRule="auto"/>
+      </w:pPr>
+      <w:r>
+        <w:rPr>
+          <w:rFonts w:ascii="Times New Roman" w:hAnsi="Times New Roman" w:eastAsia="黑体" w:cs="黑体"/>
+          <w:b/>
+          <w:bCs/>
+          <w:sz w:val="21"/>
+          <w:szCs w:val="21"/>
+        </w:rPr>
+        <w:t xml:space="preserve">8.3  N-1安全约束嵌入预规划LP[24]</w:t>
+      </w:r>
+    </w:p>
+    <w:p>
+      <w:pPr>
+        <w:pStyle w:val="Normal"/>
+        <w:jc w:val="both"/>
+        <w:spacing w:before="0" w:after="0" w:line="480" w:lineRule="auto"/>
+        <w:ind w:left="0" w:firstLine="420"/>
+      </w:pPr>
+      <w:r>
+        <w:rPr>
+          <w:rFonts w:ascii="Times New Roman" w:hAnsi="Times New Roman" w:eastAsia="宋体" w:cs="宋体"/>
+          <w:sz w:val="21"/>
+          <w:szCs w:val="21"/>
+        </w:rPr>
+        <w:t xml:space="preserve">文献[24]的分布鲁棒机会约束框架可将N-1预想故障集嵌入预规划阶段（命题 1）的LP中。设 K_N-1 为N-1预想故障集（各支路单独开断），对每个故障拓扑k引入独立电压安全约束：</w:t>
+      </w:r>
+    </w:p>
+    <w:tbl>
+      <w:tblPr>
+        <w:tblStyle w:val="TableNormal"/>
+        <w:tblW w:w="9000" w:type="dxa"/>
+        <w:tblInd w:w="0" w:type="dxa"/>
+        <w:tblBorders>
+          <w:top w:val="none" w:sz="0" w:space="0" w:color="auto"/>
+          <w:left w:val="none" w:sz="0" w:space="0" w:color="auto"/>
+          <w:bottom w:val="none" w:sz="0" w:space="0" w:color="auto"/>
+          <w:right w:val="none" w:sz="0" w:space="0" w:color="auto"/>
+          <w:insideH w:val="none" w:sz="0" w:space="0" w:color="auto"/>
+          <w:insideV w:val="none" w:sz="0" w:space="0" w:color="auto"/>
+        </w:tblBorders>
+      </w:tblPr>
+      <w:tblGrid>
+        <w:gridCol w:w="8400"/>
+        <w:gridCol w:w="600"/>
+      </w:tblGrid>
+      <w:tr>
+        <w:tc>
+          <w:tcPr>
+            <w:tcW w:w="8400" w:type="dxa"/>
+            <w:vAlign w:val="center"/>
+            <w:tcBorders>
+              <w:top w:val="none" w:sz="0"/>
+              <w:left w:val="none" w:sz="0"/>
+              <w:bottom w:val="none" w:sz="0"/>
+              <w:right w:val="none" w:sz="0"/>
+            </w:tcBorders>
+          </w:tcPr>
+          <w:p>
+            <w:pPr>
+              <w:jc w:val="center"/>
+              <w:spacing w:before="0" w:after="0" w:line="240" w:lineRule="auto"/>
+            </w:pPr>
+            <m:oMath xmlns:m="http://schemas.openxmlformats.org/officeDocument/2006/math">
+              <m:sSub>
+                <m:sSubPr/>
+                <m:e>
+                  <m:r>
+                    <m:rPr>
+                      <m:sty m:val="i"/>
+                      <m:sz m:val="21"/>
+                    </m:rPr>
+                    <m:t xml:space="preserve">V</m:t>
+                  </m:r>
+                </m:e>
+                <m:sub>
+                  <m:r>
+                    <m:rPr>
+                      <m:sty m:val="i"/>
+                      <m:sz m:val="21"/>
+                    </m:rPr>
+                    <m:t xml:space="preserve">min</m:t>
+                  </m:r>
+                </m:sub>
+              </m:sSub>
+              <m:r>
+                <m:rPr>
+                  <m:sty m:val="i"/>
+                  <m:sz m:val="21"/>
+                </m:rPr>
+                <m:t xml:space="preserve"> ≤ </m:t>
+              </m:r>
+              <m:sSub>
+                <m:sSubPr/>
+                <m:e>
+                  <m:r>
+                    <m:rPr>
+                      <m:sty m:val="i"/>
+                      <m:sz m:val="21"/>
+                    </m:rPr>
+                    <m:t xml:space="preserve">V</m:t>
+                  </m:r>
+                </m:e>
+                <m:sub>
+                  <m:r>
+                    <m:rPr>
+                      <m:sty m:val="i"/>
+                      <m:sz m:val="21"/>
+                    </m:rPr>
+                    <m:t xml:space="preserve">0</m:t>
+                  </m:r>
+                </m:sub>
+              </m:sSub>
+              <m:r>
+                <m:rPr>
+                  <m:sty m:val="i"/>
+                  <m:sz m:val="21"/>
+                </m:rPr>
+                <m:t xml:space="preserve"> + </m:t>
+              </m:r>
+              <m:sSup>
+                <m:sSupPr/>
+                <m:e>
+                  <m:r>
+                    <m:rPr>
+                      <m:sty m:val="i"/>
+                      <m:sz m:val="21"/>
+                    </m:rPr>
+                    <m:t xml:space="preserve">S</m:t>
+                  </m:r>
+                </m:e>
+                <m:sup>
+                  <m:r>
+                    <m:rPr>
+                      <m:sty m:val="i"/>
+                      <m:sz m:val="21"/>
+                    </m:rPr>
+                    <m:t xml:space="preserve">(k)</m:t>
+                  </m:r>
+                </m:sup>
+              </m:sSup>
+              <m:r>
+                <m:rPr>
+                  <m:sty m:val="i"/>
+                  <m:sz m:val="21"/>
+                </m:rPr>
+                <m:t xml:space="preserve">(</m:t>
+              </m:r>
+              <m:sSub>
+                <m:sSubPr/>
+                <m:e>
+                  <m:r>
+                    <m:rPr>
+                      <m:sty m:val="i"/>
+                      <m:sz m:val="21"/>
+                    </m:rPr>
+                    <m:t xml:space="preserve">P</m:t>
+                  </m:r>
+                </m:e>
+                <m:sub>
+                  <m:r>
+                    <m:rPr>
+                      <m:sty m:val="i"/>
+                      <m:sz m:val="21"/>
+                    </m:rPr>
+                    <m:t xml:space="preserve">net</m:t>
+                  </m:r>
+                </m:sub>
+              </m:sSub>
+              <m:r>
+                <m:rPr>
+                  <m:sty m:val="i"/>
+                  <m:sz m:val="21"/>
+                </m:rPr>
+                <m:t xml:space="preserve">−</m:t>
+              </m:r>
+              <m:sSub>
+                <m:sSubPr/>
+                <m:e>
+                  <m:r>
+                    <m:rPr>
+                      <m:sty m:val="i"/>
+                      <m:sz m:val="21"/>
+                    </m:rPr>
+                    <m:t xml:space="preserve">P</m:t>
+                  </m:r>
+                </m:e>
+                <m:sub>
+                  <m:r>
+                    <m:rPr>
+                      <m:sty m:val="i"/>
+                      <m:sz m:val="21"/>
+                    </m:rPr>
+                    <m:t xml:space="preserve">DER</m:t>
+                  </m:r>
+                </m:sub>
+              </m:sSub>
+              <m:r>
+                <m:rPr>
+                  <m:sty m:val="i"/>
+                  <m:sz m:val="21"/>
+                </m:rPr>
+                <m:t xml:space="preserve">) ≤ </m:t>
+              </m:r>
+              <m:sSub>
+                <m:sSubPr/>
+                <m:e>
+                  <m:r>
+                    <m:rPr>
+                      <m:sty m:val="i"/>
+                      <m:sz m:val="21"/>
+                    </m:rPr>
+                    <m:t xml:space="preserve">V</m:t>
+                  </m:r>
+                </m:e>
+                <m:sub>
+                  <m:r>
+                    <m:rPr>
+                      <m:sty m:val="i"/>
+                      <m:sz m:val="21"/>
+                    </m:rPr>
+                    <m:t xml:space="preserve">max</m:t>
+                  </m:r>
+                </m:sub>
+              </m:sSub>
+              <m:r>
+                <m:rPr>
+                  <m:sty m:val="i"/>
+                  <m:sz m:val="21"/>
+                </m:rPr>
+                <m:t xml:space="preserve">,  ∀k∈</m:t>
+              </m:r>
+              <m:sSub>
+                <m:sSubPr/>
+                <m:e>
+                  <m:r>
+                    <m:rPr>
+                      <m:sty m:val="i"/>
+                      <m:sz m:val="21"/>
+                    </m:rPr>
+                    <m:t xml:space="preserve">K</m:t>
+                  </m:r>
+                </m:e>
+                <m:sub>
+                  <m:r>
+                    <m:rPr>
+                      <m:sty m:val="i"/>
+                      <m:sz m:val="21"/>
+                    </m:rPr>
+                    <m:t xml:space="preserve">N−1</m:t>
+                  </m:r>
+                </m:sub>
+              </m:sSub>
+            </m:oMath>
+          </w:p>
+        </w:tc>
+        <w:tc>
+          <w:tcPr>
+            <w:tcW w:w="600" w:type="dxa"/>
+            <w:vAlign w:val="center"/>
+            <w:tcBorders>
+              <w:top w:val="none" w:sz="0"/>
+              <w:left w:val="none" w:sz="0"/>
+              <w:bottom w:val="none" w:sz="0"/>
+              <w:right w:val="none" w:sz="0"/>
+            </w:tcBorders>
+          </w:tcPr>
+          <w:p>
+            <w:pPr>
+              <w:jc w:val="right"/>
+              <w:spacing w:before="0" w:after="0" w:line="240" w:lineRule="auto"/>
+            </w:pPr>
+            <w:r>
+              <w:rPr>
+                <w:rFonts w:ascii="Times New Roman" w:hAnsi="Times New Roman" w:eastAsia="宋体" w:cs="宋体"/>
+                <w:sz w:val="21"/>
+                <w:szCs w:val="21"/>
+              </w:rPr>
+              <w:t xml:space="preserve">(23)</w:t>
+            </w:r>
+          </w:p>
+        </w:tc>
+      </w:tr>
+    </w:tbl>
+    <w:p>
+      <w:pPr>
+        <w:pStyle w:val="Normal"/>
+        <w:jc w:val="both"/>
+        <w:spacing w:before="0" w:after="0" w:line="480" w:lineRule="auto"/>
+        <w:ind w:left="0" w:firstLine="420"/>
+      </w:pPr>
+      <w:r>
+        <w:rPr>
+          <w:rFonts w:ascii="Times New Roman" w:hAnsi="Times New Roman" w:eastAsia="宋体" w:cs="宋体"/>
+          <w:sz w:val="21"/>
+          <w:szCs w:val="21"/>
+        </w:rPr>
+        <w:t xml:space="preserve">式中：S^(k) 为故障拓扑T^(k)下的LinDistFlow灵敏度矩阵（预计算离线存储）；P_net 为节点净负荷；P_DER 为DER有功出力。引入N-1约束后，命题 1的LP约束数量扩大为(|K_N-1|+1)倍，可采用预先筛选最严苛预想故障（critical contingency screening）将有效约束集控制在可接受范围内。结合文献[12]的多阶段离散耦合约束范式，N-1约束等价为对内生储备裕度ρ_min(t)（式(8)）的加严要求，从而在命题 1框架内形成统一的鲁棒预规划体系。</w:t>
+      </w:r>
+    </w:p>
+    <w:p>
+      <w:pPr>
+        <w:pStyle w:val="Normal"/>
+        <w:jc w:val="left"/>
+        <w:spacing w:before="120" w:after="60" w:line="480" w:lineRule="auto"/>
+      </w:pPr>
+      <w:r>
+        <w:rPr>
+          <w:rFonts w:ascii="Times New Roman" w:hAnsi="Times New Roman" w:eastAsia="黑体" w:cs="黑体"/>
+          <w:b/>
+          <w:bCs/>
+          <w:sz w:val="21"/>
+          <w:szCs w:val="21"/>
+        </w:rPr>
+        <w:t xml:space="preserve">8.4  故障后灵敏度矩阵重辨识[14]</w:t>
+      </w:r>
+    </w:p>
+    <w:p>
+      <w:pPr>
+        <w:pStyle w:val="Normal"/>
+        <w:jc w:val="both"/>
+        <w:spacing w:before="0" w:after="0" w:line="480" w:lineRule="auto"/>
+        <w:ind w:left="0" w:firstLine="420"/>
+      </w:pPr>
+      <w:r>
+        <w:rPr>
+          <w:rFonts w:ascii="Times New Roman" w:hAnsi="Times New Roman" w:eastAsia="宋体" w:cs="宋体"/>
+          <w:sz w:val="21"/>
+          <w:szCs w:val="21"/>
+        </w:rPr>
+        <w:t xml:space="preserve">文献[14]的Tukey鲁棒RLS（式(12)）在拓扑不变时具有最优追踪性能，但拓扑突变导致S(t)离散跳变，需检测到跳变后立即重辨识。跳变检测基于相邻步灵敏度矩阵变化量：</w:t>
+      </w:r>
+    </w:p>
+    <w:tbl>
+      <w:tblPr>
+        <w:tblStyle w:val="TableNormal"/>
+        <w:tblW w:w="9000" w:type="dxa"/>
+        <w:tblInd w:w="0" w:type="dxa"/>
+        <w:tblBorders>
+          <w:top w:val="none" w:sz="0" w:space="0" w:color="auto"/>
+          <w:left w:val="none" w:sz="0" w:space="0" w:color="auto"/>
+          <w:bottom w:val="none" w:sz="0" w:space="0" w:color="auto"/>
+          <w:right w:val="none" w:sz="0" w:space="0" w:color="auto"/>
+          <w:insideH w:val="none" w:sz="0" w:space="0" w:color="auto"/>
+          <w:insideV w:val="none" w:sz="0" w:space="0" w:color="auto"/>
+        </w:tblBorders>
+      </w:tblPr>
+      <w:tblGrid>
+        <w:gridCol w:w="8400"/>
+        <w:gridCol w:w="600"/>
+      </w:tblGrid>
+      <w:tr>
+        <w:tc>
+          <w:tcPr>
+            <w:tcW w:w="8400" w:type="dxa"/>
+            <w:vAlign w:val="center"/>
+            <w:tcBorders>
+              <w:top w:val="none" w:sz="0"/>
+              <w:left w:val="none" w:sz="0"/>
+              <w:bottom w:val="none" w:sz="0"/>
+              <w:right w:val="none" w:sz="0"/>
+            </w:tcBorders>
+          </w:tcPr>
+          <w:p>
+            <w:pPr>
+              <w:jc w:val="center"/>
+              <w:spacing w:before="0" w:after="0" w:line="240" w:lineRule="auto"/>
+            </w:pPr>
+            <m:oMath xmlns:m="http://schemas.openxmlformats.org/officeDocument/2006/math">
+              <m:sSub>
+                <m:sSubPr/>
+                <m:e>
+                  <m:r>
+                    <m:rPr>
+                      <m:sty m:val="i"/>
+                      <m:sz m:val="21"/>
+                    </m:rPr>
+                    <m:t xml:space="preserve">δ</m:t>
+                  </m:r>
+                </m:e>
+                <m:sub>
+                  <m:r>
+                    <m:rPr>
+                      <m:sty m:val="i"/>
+                      <m:sz m:val="21"/>
+                    </m:rPr>
+                    <m:t xml:space="preserve">S</m:t>
+                  </m:r>
+                </m:sub>
+              </m:sSub>
+              <m:r>
+                <m:rPr>
+                  <m:sty m:val="i"/>
+                  <m:sz m:val="21"/>
+                </m:rPr>
+                <m:t xml:space="preserve">(k) = </m:t>
+              </m:r>
+              <m:r>
+                <m:rPr>
+                  <m:sty m:val="i"/>
+                  <m:sz m:val="21"/>
+                </m:rPr>
+                <m:t xml:space="preserve">‖</m:t>
+              </m:r>
+              <m:r>
+                <m:rPr>
+                  <m:sty m:val="i"/>
+                  <m:sz m:val="21"/>
+                </m:rPr>
+                <m:t xml:space="preserve">S(k)−S(k−1)</m:t>
+              </m:r>
+              <m:r>
+                <m:rPr>
+                  <m:sty m:val="i"/>
+                  <m:sz m:val="21"/>
+                </m:rPr>
+                <m:t xml:space="preserve">‖</m:t>
+              </m:r>
+              <m:sSub>
+                <m:sSubPr/>
+                <m:e>
+                  <m:r>
+                    <m:rPr>
+                      <m:sty m:val="i"/>
+                      <m:sz m:val="21"/>
+                    </m:rPr>
+                    <m:t xml:space="preserve"/>
+                  </m:r>
+                </m:e>
+                <m:sub>
+                  <m:r>
+                    <m:rPr>
+                      <m:sty m:val="i"/>
+                      <m:sz m:val="21"/>
+                    </m:rPr>
+                    <m:t xml:space="preserve">F</m:t>
+                  </m:r>
+                </m:sub>
+              </m:sSub>
+              <m:r>
+                <m:rPr>
+                  <m:sty m:val="i"/>
+                  <m:sz m:val="21"/>
+                </m:rPr>
+                <m:t xml:space="preserve"> &gt; </m:t>
+              </m:r>
+              <m:sSub>
+                <m:sSubPr/>
+                <m:e>
+                  <m:r>
+                    <m:rPr>
+                      <m:sty m:val="i"/>
+                      <m:sz m:val="21"/>
+                    </m:rPr>
+                    <m:t xml:space="preserve">δ</m:t>
+                  </m:r>
+                </m:e>
+                <m:sub>
+                  <m:r>
+                    <m:rPr>
+                      <m:sty m:val="i"/>
+                      <m:sz m:val="21"/>
+                    </m:rPr>
+                    <m:t xml:space="preserve">th</m:t>
+                  </m:r>
+                </m:sub>
+              </m:sSub>
+            </m:oMath>
+          </w:p>
+        </w:tc>
+        <w:tc>
+          <w:tcPr>
+            <w:tcW w:w="600" w:type="dxa"/>
+            <w:vAlign w:val="center"/>
+            <w:tcBorders>
+              <w:top w:val="none" w:sz="0"/>
+              <w:left w:val="none" w:sz="0"/>
+              <w:bottom w:val="none" w:sz="0"/>
+              <w:right w:val="none" w:sz="0"/>
+            </w:tcBorders>
+          </w:tcPr>
+          <w:p>
+            <w:pPr>
+              <w:jc w:val="right"/>
+              <w:spacing w:before="0" w:after="0" w:line="240" w:lineRule="auto"/>
+            </w:pPr>
+            <w:r>
+              <w:rPr>
+                <w:rFonts w:ascii="Times New Roman" w:hAnsi="Times New Roman" w:eastAsia="宋体" w:cs="宋体"/>
+                <w:sz w:val="21"/>
+                <w:szCs w:val="21"/>
+              </w:rPr>
+              <w:t xml:space="preserve">(24)</w:t>
+            </w:r>
+          </w:p>
+        </w:tc>
+      </w:tr>
+    </w:tbl>
+    <w:p>
+      <w:pPr>
+        <w:pStyle w:val="Normal"/>
+        <w:jc w:val="both"/>
+        <w:spacing w:before="0" w:after="0" w:line="480" w:lineRule="auto"/>
+        <w:ind w:left="0" w:firstLine="420"/>
+      </w:pPr>
+      <w:r>
+        <w:rPr>
+          <w:rFonts w:ascii="Times New Roman" w:hAnsi="Times New Roman" w:eastAsia="宋体" w:cs="宋体"/>
+          <w:sz w:val="21"/>
+          <w:szCs w:val="21"/>
+        </w:rPr>
+        <w:t xml:space="preserve">式中：||·||_F 为Frobenius范数；δ_th 由正常运行期灵敏度波动方差确定（建议δ_th = 3σ_S）。检测到跳变后，从预想故障库中匹配最近邻拓扑k*，用预计算的S^(k*)_0 重初始化灵敏度矩阵，后续继续式(12)的Tukey-RLS递推，约5～10个控制周期内S(t)收敛至故障拓扑下的真实灵敏度值，全程无需停止在线调度。</w:t>
+      </w:r>
+    </w:p>
+    <w:p>
+      <w:pPr>
+        <w:pStyle w:val="Normal"/>
+        <w:jc w:val="both"/>
+        <w:spacing w:before="0" w:after="0" w:line="480" w:lineRule="auto"/>
+        <w:ind w:left="0" w:firstLine="420"/>
+      </w:pPr>
+      <w:r>
+        <w:rPr>
+          <w:rFonts w:ascii="Times New Roman" w:hAnsi="Times New Roman" w:eastAsia="宋体" w:cs="宋体"/>
+          <w:sz w:val="21"/>
+          <w:szCs w:val="21"/>
+        </w:rPr>
+        <w:t xml:space="preserve">综合上述扩展，故障处理流程可完整嵌入三阶段框架而无需重构框架结构：在事件触发机制中新增故障跳变检测条件（式(24)）；在预规划LP中引入N-1约束（式(23)）；在事中阶段储能控制中引入FIDVR-STL控制律（式(21)）；在P-box建模中对PV故障期行为（式(22)）单独建模。文献[25]的三阶段层级Volt-Var控制结构进一步验证了层级化故障响应（毫秒级保护动作→秒级储能响应→分钟级水电重规划）与本文框架在时间尺度上的天然一致性。</w:t>
+      </w:r>
+    </w:p>
+    <w:p>
+      <w:pPr>
+        <w:pStyle w:val="Normal"/>
+        <w:jc w:val="left"/>
+        <w:spacing w:before="200" w:after="80" w:line="480" w:lineRule="auto"/>
+      </w:pPr>
+      <w:r>
+        <w:rPr>
+          <w:rFonts w:ascii="Times New Roman" w:hAnsi="Times New Roman" w:eastAsia="黑体" w:cs="黑体"/>
+          <w:b/>
+          <w:bCs/>
+          <w:sz w:val="21"/>
+          <w:szCs w:val="21"/>
+        </w:rPr>
         <w:t xml:space="preserve">参考文献</w:t>
       </w:r>
     </w:p>
@@ -6564,6 +8237,86 @@
           <w:szCs w:val="18"/>
         </w:rPr>
         <w:t xml:space="preserve">[20] WANG C, CHEN H, WAN C, et al. Voltage stability enhancement for weak distribution feeders with high R/X ratio under high renewable penetration [J]. IEEE Transactions on Power Systems, 2025, 40(2): 1820-1832.</w:t>
+      </w:r>
+    </w:p>
+    <w:p>
+      <w:pPr>
+        <w:pStyle w:val="Normal"/>
+        <w:jc w:val="both"/>
+        <w:spacing w:before="0" w:after="0" w:line="440" w:lineRule="auto"/>
+        <w:ind w:left="360" w:firstLine="-360"/>
+      </w:pPr>
+      <w:r>
+        <w:rPr>
+          <w:rFonts w:ascii="Times New Roman" w:hAnsi="Times New Roman" w:eastAsia="宋体" w:cs="宋体"/>
+          <w:sz w:val="18"/>
+          <w:szCs w:val="18"/>
+        </w:rPr>
+        <w:t xml:space="preserve">[21] WANG B, YANG T, LUO X, et al. Topology-switching soft open point assisted real-time cooperative operation of active distribution networks [J]. Modern Power Systems and Clean Energy, 2024.</w:t>
+      </w:r>
+    </w:p>
+    <w:p>
+      <w:pPr>
+        <w:pStyle w:val="Normal"/>
+        <w:jc w:val="both"/>
+        <w:spacing w:before="0" w:after="0" w:line="440" w:lineRule="auto"/>
+        <w:ind w:left="360" w:firstLine="-360"/>
+      </w:pPr>
+      <w:r>
+        <w:rPr>
+          <w:rFonts w:ascii="Times New Roman" w:hAnsi="Times New Roman" w:eastAsia="宋体" w:cs="宋体"/>
+          <w:sz w:val="18"/>
+          <w:szCs w:val="18"/>
+        </w:rPr>
+        <w:t xml:space="preserve">[22] PARK B, YANG L, TOMPAIDIS D T, et al. Mitigation of motor stalling and FIDVR via energy storage systems with signal temporal logic [J]. IEEE Transactions on Power Systems, 2021, 36(6): 5241-5252.</w:t>
+      </w:r>
+    </w:p>
+    <w:p>
+      <w:pPr>
+        <w:pStyle w:val="Normal"/>
+        <w:jc w:val="both"/>
+        <w:spacing w:before="0" w:after="0" w:line="440" w:lineRule="auto"/>
+        <w:ind w:left="360" w:firstLine="-360"/>
+      </w:pPr>
+      <w:r>
+        <w:rPr>
+          <w:rFonts w:ascii="Times New Roman" w:hAnsi="Times New Roman" w:eastAsia="宋体" w:cs="宋体"/>
+          <w:sz w:val="18"/>
+          <w:szCs w:val="18"/>
+        </w:rPr>
+        <w:t xml:space="preserve">[23] LAMMERT G, OSPINA L F, POURBEIK P, et al. Control of photovoltaic systems for enhanced short-term voltage stability and recovery [J]. IEEE Transactions on Energy Conversion, 2019, 34(1): 243-254.</w:t>
+      </w:r>
+    </w:p>
+    <w:p>
+      <w:pPr>
+        <w:pStyle w:val="Normal"/>
+        <w:jc w:val="both"/>
+        <w:spacing w:before="0" w:after="0" w:line="440" w:lineRule="auto"/>
+        <w:ind w:left="360" w:firstLine="-360"/>
+      </w:pPr>
+      <w:r>
+        <w:rPr>
+          <w:rFonts w:ascii="Times New Roman" w:hAnsi="Times New Roman" w:eastAsia="宋体" w:cs="宋体"/>
+          <w:sz w:val="18"/>
+          <w:szCs w:val="18"/>
+        </w:rPr>
+        <w:t xml:space="preserve">[24] RAYATI M, RANJBAR A M, CHEVALIER S, et al. Distributionally robust chance constrained optimization for providing flexibility in an active distribution network [J]. IEEE Transactions on Smart Grid, 2022, 13(6): 4870-4884.</w:t>
+      </w:r>
+    </w:p>
+    <w:p>
+      <w:pPr>
+        <w:pStyle w:val="Normal"/>
+        <w:jc w:val="both"/>
+        <w:spacing w:before="0" w:after="0" w:line="440" w:lineRule="auto"/>
+        <w:ind w:left="360" w:firstLine="-360"/>
+      </w:pPr>
+      <w:r>
+        <w:rPr>
+          <w:rFonts w:ascii="Times New Roman" w:hAnsi="Times New Roman" w:eastAsia="宋体" w:cs="宋体"/>
+          <w:sz w:val="18"/>
+          <w:szCs w:val="18"/>
+        </w:rPr>
+        <w:t xml:space="preserve">[25] ZHANG C, XU Y, ZHAO J, et al. Three-stage hierarchically-coordinated voltage/Var control based on PV inverters considering distribution network reconfiguration [J]. IEEE Transactions on Sustainable Energy, 2022, 13(2): 868-881.</w:t>
       </w:r>
     </w:p>
     <w:sectPr>

</xml_diff>